<commit_message>
feat: improve service desk workflows and harden security
- add static information fields to service request forms
- improve admin catalog and management screens
- add password visibility and Enter-to-save modal behavior
- redesign collapsed sidebar with hover expansion
- harden refresh tokens, uploads, ticket resolution, and account access
- revoke sessions after admin password resets
- refresh the DOCX user manual with screenshots
- update dependencies and expand regression coverage
</commit_message>
<xml_diff>
--- a/docs/user-manual/NDMU-ICT-MIS-Service-Desk-User-Manual.docx
+++ b/docs/user-manual/NDMU-ICT-MIS-Service-Desk-User-Manual.docx
@@ -96,7 +96,7 @@
           <w:sz w:val="18"/>
           <w:szCs w:val="18"/>
         </w:rPr>
-        <w:t xml:space="preserve">Version 1.0 | September 2026</w:t>
+        <w:t xml:space="preserve">Version 1.1 | September 2026</w:t>
       </w:r>
     </w:p>
     <w:p>
@@ -527,6 +527,23 @@
       </w:r>
     </w:p>
     <w:p>
+      <w:pPr>
+        <w:spacing w:after="120" w:line="276"/>
+        <w:rPr>
+          <w:color w:val="00452B"/>
+        </w:rPr>
+      </w:pPr>
+      <w:r>
+        <w:rPr>
+          <w:rFonts w:ascii="Aptos" w:cs="Aptos" w:eastAsia="Aptos" w:hAnsi="Aptos"/>
+          <w:color w:val="00452B"/>
+          <w:sz w:val="20"/>
+          <w:szCs w:val="20"/>
+        </w:rPr>
+        <w:t xml:space="preserve">On desktop, the compact icon rail expands while you hover over it. Use the navigation button in the top bar to keep the full sidebar open or return it to the compact rail.</w:t>
+      </w:r>
+    </w:p>
+    <w:p>
       <w:r>
         <w:br w:type="page"/>
       </w:r>
@@ -658,7 +675,7 @@
           <w:sz w:val="20"/>
           <w:szCs w:val="20"/>
         </w:rPr>
-        <w:t xml:space="preserve">Select the relevant service item. The form may show additional service-specific questions.</w:t>
+        <w:t xml:space="preserve">Select the relevant service item. The form may show additional service-specific questions or read-only information messages. Read each information message, then continue with the fields that accept a response.</w:t>
       </w:r>
     </w:p>
     <w:p>
@@ -1165,7 +1182,7 @@
           <w:sz w:val="20"/>
           <w:szCs w:val="20"/>
         </w:rPr>
-        <w:t xml:space="preserve">When work is complete, add a concise resolution note and mark the ticket resolved. The requestor can confirm or reopen it.</w:t>
+        <w:t xml:space="preserve">When work is complete, add a concise resolution note and mark the ticket resolved. Only then can the requestor confirm closure or reopen the ticket if the issue persists.</w:t>
       </w:r>
     </w:p>
     <w:p>
@@ -1296,6 +1313,23 @@
     </w:p>
     <w:p>
       <w:pPr>
+        <w:spacing w:after="120" w:line="276"/>
+        <w:rPr>
+          <w:color w:val="00452B"/>
+        </w:rPr>
+      </w:pPr>
+      <w:r>
+        <w:rPr>
+          <w:rFonts w:ascii="Aptos" w:cs="Aptos" w:eastAsia="Aptos" w:hAnsi="Aptos"/>
+          <w:color w:val="00452B"/>
+          <w:sz w:val="20"/>
+          <w:szCs w:val="20"/>
+        </w:rPr>
+        <w:t xml:space="preserve">When an administrator resets a password, the user's existing refresh sessions are revoked. The user must sign in again with the new password.</w:t>
+      </w:r>
+    </w:p>
+    <w:p>
+      <w:pPr>
         <w:pStyle w:val="Heading2"/>
         <w:spacing w:before="120" w:after="100"/>
       </w:pPr>
@@ -1318,7 +1352,7 @@
           <w:sz w:val="20"/>
           <w:szCs w:val="20"/>
         </w:rPr>
-        <w:t xml:space="preserve">Catalog: maintain service categories, service items, dynamic intake fields, and service expectations.</w:t>
+        <w:t xml:space="preserve">Catalog: maintain service categories, service items, dynamic intake fields, and service expectations. Choose Information message as an answer type to add a non-clickable heading and guidance panel to a request form; it never captures or requires a response.</w:t>
       </w:r>
     </w:p>
     <w:p>

</xml_diff>